<commit_message>
Make table signs fold-able tents and shrink draw slips to one page
- Table signs: name now sits in the bottom half of each landscape page
  only, with a dashed fold line across the middle, so folding into an
  A-frame shows the name upright on one face.
- Draw slips: much smaller, uniform 5x10 grid fitting all 50 slips
  (5 of each team) on a single A4 page.

https://claude.ai/code/session_015tq3fk2n9ULKTYMaMWnxtz
</commit_message>
<xml_diff>
--- a/team_cards/draw_slips.docx
+++ b/team_cards/draw_slips.docx
@@ -10,17 +10,20 @@
         <w:tblLook w:firstColumn="1" w:firstRow="1" w:lastColumn="0" w:lastRow="0" w:noHBand="0" w:noVBand="1" w:val="04A0"/>
       </w:tblPr>
       <w:tblGrid>
-        <w:gridCol w:w="5386"/>
-        <w:gridCol w:w="5386"/>
+        <w:gridCol w:w="2154"/>
+        <w:gridCol w:w="2154"/>
+        <w:gridCol w:w="2154"/>
+        <w:gridCol w:w="2154"/>
+        <w:gridCol w:w="2154"/>
       </w:tblGrid>
       <w:tr>
         <w:trPr>
-          <w:trHeight w:val="2948"/>
-          <w:trHeight w:val="1872000" w:hRule="exact"/>
+          <w:trHeight w:val="1417"/>
+          <w:trHeight w:val="900000" w:hRule="exact"/>
         </w:trPr>
         <w:tc>
           <w:tcPr>
-            <w:tcW w:type="dxa" w:w="5102"/>
+            <w:tcW w:type="dxa" w:w="2041"/>
             <w:tcBorders>
               <w:top w:val="dashed" w:sz="12" w:space="0" w:color="888888"/>
               <w:left w:val="dashed" w:sz="12" w:space="0" w:color="888888"/>
@@ -38,7 +41,7 @@
                 <w:rFonts w:ascii="Calibri" w:hAnsi="Calibri" w:cs="Calibri" w:eastAsia="Calibri"/>
                 <w:b/>
                 <w:color w:val="000000"/>
-                <w:sz w:val="64"/>
+                <w:sz w:val="32"/>
               </w:rPr>
               <w:t>Asveja</w:t>
             </w:r>
@@ -46,7 +49,7 @@
         </w:tc>
         <w:tc>
           <w:tcPr>
-            <w:tcW w:type="dxa" w:w="5102"/>
+            <w:tcW w:type="dxa" w:w="2041"/>
             <w:tcBorders>
               <w:top w:val="dashed" w:sz="12" w:space="0" w:color="888888"/>
               <w:left w:val="dashed" w:sz="12" w:space="0" w:color="888888"/>
@@ -64,21 +67,15 @@
                 <w:rFonts w:ascii="Calibri" w:hAnsi="Calibri" w:cs="Calibri" w:eastAsia="Calibri"/>
                 <w:b/>
                 <w:color w:val="000000"/>
-                <w:sz w:val="64"/>
+                <w:sz w:val="32"/>
               </w:rPr>
               <w:t>Tauragnas</w:t>
             </w:r>
           </w:p>
         </w:tc>
-      </w:tr>
-      <w:tr>
-        <w:trPr>
-          <w:trHeight w:val="2948"/>
-          <w:trHeight w:val="1872000" w:hRule="exact"/>
-        </w:trPr>
         <w:tc>
           <w:tcPr>
-            <w:tcW w:type="dxa" w:w="5102"/>
+            <w:tcW w:type="dxa" w:w="2041"/>
             <w:tcBorders>
               <w:top w:val="dashed" w:sz="12" w:space="0" w:color="888888"/>
               <w:left w:val="dashed" w:sz="12" w:space="0" w:color="888888"/>
@@ -96,7 +93,7 @@
                 <w:rFonts w:ascii="Calibri" w:hAnsi="Calibri" w:cs="Calibri" w:eastAsia="Calibri"/>
                 <w:b/>
                 <w:color w:val="000000"/>
-                <w:sz w:val="64"/>
+                <w:sz w:val="32"/>
               </w:rPr>
               <w:t>Dusia</w:t>
             </w:r>
@@ -104,7 +101,7 @@
         </w:tc>
         <w:tc>
           <w:tcPr>
-            <w:tcW w:type="dxa" w:w="5102"/>
+            <w:tcW w:type="dxa" w:w="2041"/>
             <w:tcBorders>
               <w:top w:val="dashed" w:sz="12" w:space="0" w:color="888888"/>
               <w:left w:val="dashed" w:sz="12" w:space="0" w:color="888888"/>
@@ -122,21 +119,15 @@
                 <w:rFonts w:ascii="Calibri" w:hAnsi="Calibri" w:cs="Calibri" w:eastAsia="Calibri"/>
                 <w:b/>
                 <w:color w:val="000000"/>
-                <w:sz w:val="64"/>
+                <w:sz w:val="32"/>
               </w:rPr>
               <w:t>Sartai</w:t>
             </w:r>
           </w:p>
         </w:tc>
-      </w:tr>
-      <w:tr>
-        <w:trPr>
-          <w:trHeight w:val="2948"/>
-          <w:trHeight w:val="1872000" w:hRule="exact"/>
-        </w:trPr>
         <w:tc>
           <w:tcPr>
-            <w:tcW w:type="dxa" w:w="5102"/>
+            <w:tcW w:type="dxa" w:w="2041"/>
             <w:tcBorders>
               <w:top w:val="dashed" w:sz="12" w:space="0" w:color="888888"/>
               <w:left w:val="dashed" w:sz="12" w:space="0" w:color="888888"/>
@@ -154,15 +145,21 @@
                 <w:rFonts w:ascii="Calibri" w:hAnsi="Calibri" w:cs="Calibri" w:eastAsia="Calibri"/>
                 <w:b/>
                 <w:color w:val="000000"/>
-                <w:sz w:val="64"/>
+                <w:sz w:val="32"/>
               </w:rPr>
               <w:t>Plateliai</w:t>
             </w:r>
           </w:p>
         </w:tc>
+      </w:tr>
+      <w:tr>
+        <w:trPr>
+          <w:trHeight w:val="1417"/>
+          <w:trHeight w:val="900000" w:hRule="exact"/>
+        </w:trPr>
         <w:tc>
           <w:tcPr>
-            <w:tcW w:type="dxa" w:w="5102"/>
+            <w:tcW w:type="dxa" w:w="2041"/>
             <w:tcBorders>
               <w:top w:val="dashed" w:sz="12" w:space="0" w:color="888888"/>
               <w:left w:val="dashed" w:sz="12" w:space="0" w:color="888888"/>
@@ -180,21 +177,15 @@
                 <w:rFonts w:ascii="Calibri" w:hAnsi="Calibri" w:cs="Calibri" w:eastAsia="Calibri"/>
                 <w:b/>
                 <w:color w:val="000000"/>
-                <w:sz w:val="64"/>
+                <w:sz w:val="32"/>
               </w:rPr>
               <w:t>Neris</w:t>
             </w:r>
           </w:p>
         </w:tc>
-      </w:tr>
-      <w:tr>
-        <w:trPr>
-          <w:trHeight w:val="2948"/>
-          <w:trHeight w:val="1872000" w:hRule="exact"/>
-        </w:trPr>
         <w:tc>
           <w:tcPr>
-            <w:tcW w:type="dxa" w:w="5102"/>
+            <w:tcW w:type="dxa" w:w="2041"/>
             <w:tcBorders>
               <w:top w:val="dashed" w:sz="12" w:space="0" w:color="888888"/>
               <w:left w:val="dashed" w:sz="12" w:space="0" w:color="888888"/>
@@ -212,7 +203,7 @@
                 <w:rFonts w:ascii="Calibri" w:hAnsi="Calibri" w:cs="Calibri" w:eastAsia="Calibri"/>
                 <w:b/>
                 <w:color w:val="000000"/>
-                <w:sz w:val="64"/>
+                <w:sz w:val="32"/>
               </w:rPr>
               <w:t>Nemunas</w:t>
             </w:r>
@@ -220,7 +211,7 @@
         </w:tc>
         <w:tc>
           <w:tcPr>
-            <w:tcW w:type="dxa" w:w="5102"/>
+            <w:tcW w:type="dxa" w:w="2041"/>
             <w:tcBorders>
               <w:top w:val="dashed" w:sz="12" w:space="0" w:color="888888"/>
               <w:left w:val="dashed" w:sz="12" w:space="0" w:color="888888"/>
@@ -238,21 +229,15 @@
                 <w:rFonts w:ascii="Calibri" w:hAnsi="Calibri" w:cs="Calibri" w:eastAsia="Calibri"/>
                 <w:b/>
                 <w:color w:val="000000"/>
-                <w:sz w:val="64"/>
+                <w:sz w:val="32"/>
               </w:rPr>
               <w:t>Venta</w:t>
             </w:r>
           </w:p>
         </w:tc>
-      </w:tr>
-      <w:tr>
-        <w:trPr>
-          <w:trHeight w:val="2948"/>
-          <w:trHeight w:val="1872000" w:hRule="exact"/>
-        </w:trPr>
         <w:tc>
           <w:tcPr>
-            <w:tcW w:type="dxa" w:w="5102"/>
+            <w:tcW w:type="dxa" w:w="2041"/>
             <w:tcBorders>
               <w:top w:val="dashed" w:sz="12" w:space="0" w:color="888888"/>
               <w:left w:val="dashed" w:sz="12" w:space="0" w:color="888888"/>
@@ -270,7 +255,7 @@
                 <w:rFonts w:ascii="Calibri" w:hAnsi="Calibri" w:cs="Calibri" w:eastAsia="Calibri"/>
                 <w:b/>
                 <w:color w:val="000000"/>
-                <w:sz w:val="64"/>
+                <w:sz w:val="32"/>
               </w:rPr>
               <w:t>Merkys</w:t>
             </w:r>
@@ -278,7 +263,7 @@
         </w:tc>
         <w:tc>
           <w:tcPr>
-            <w:tcW w:type="dxa" w:w="5102"/>
+            <w:tcW w:type="dxa" w:w="2041"/>
             <w:tcBorders>
               <w:top w:val="dashed" w:sz="12" w:space="0" w:color="888888"/>
               <w:left w:val="dashed" w:sz="12" w:space="0" w:color="888888"/>
@@ -296,38 +281,21 @@
                 <w:rFonts w:ascii="Calibri" w:hAnsi="Calibri" w:cs="Calibri" w:eastAsia="Calibri"/>
                 <w:b/>
                 <w:color w:val="000000"/>
-                <w:sz w:val="64"/>
+                <w:sz w:val="32"/>
               </w:rPr>
               <w:t>Šešupė</w:t>
             </w:r>
           </w:p>
         </w:tc>
       </w:tr>
-    </w:tbl>
-    <w:p>
-      <w:r>
-        <w:br w:type="page"/>
-      </w:r>
-    </w:p>
-    <w:tbl>
-      <w:tblPr>
-        <w:tblW w:type="auto" w:w="0"/>
-        <w:jc w:val="center"/>
-        <w:tblLayout w:type="fixed"/>
-        <w:tblLook w:firstColumn="1" w:firstRow="1" w:lastColumn="0" w:lastRow="0" w:noHBand="0" w:noVBand="1" w:val="04A0"/>
-      </w:tblPr>
-      <w:tblGrid>
-        <w:gridCol w:w="5386"/>
-        <w:gridCol w:w="5386"/>
-      </w:tblGrid>
       <w:tr>
         <w:trPr>
-          <w:trHeight w:val="2948"/>
-          <w:trHeight w:val="1872000" w:hRule="exact"/>
+          <w:trHeight w:val="1417"/>
+          <w:trHeight w:val="900000" w:hRule="exact"/>
         </w:trPr>
         <w:tc>
           <w:tcPr>
-            <w:tcW w:type="dxa" w:w="5102"/>
+            <w:tcW w:type="dxa" w:w="2041"/>
             <w:tcBorders>
               <w:top w:val="dashed" w:sz="12" w:space="0" w:color="888888"/>
               <w:left w:val="dashed" w:sz="12" w:space="0" w:color="888888"/>
@@ -345,7 +313,7 @@
                 <w:rFonts w:ascii="Calibri" w:hAnsi="Calibri" w:cs="Calibri" w:eastAsia="Calibri"/>
                 <w:b/>
                 <w:color w:val="000000"/>
-                <w:sz w:val="64"/>
+                <w:sz w:val="32"/>
               </w:rPr>
               <w:t>Asveja</w:t>
             </w:r>
@@ -353,7 +321,7 @@
         </w:tc>
         <w:tc>
           <w:tcPr>
-            <w:tcW w:type="dxa" w:w="5102"/>
+            <w:tcW w:type="dxa" w:w="2041"/>
             <w:tcBorders>
               <w:top w:val="dashed" w:sz="12" w:space="0" w:color="888888"/>
               <w:left w:val="dashed" w:sz="12" w:space="0" w:color="888888"/>
@@ -371,21 +339,15 @@
                 <w:rFonts w:ascii="Calibri" w:hAnsi="Calibri" w:cs="Calibri" w:eastAsia="Calibri"/>
                 <w:b/>
                 <w:color w:val="000000"/>
-                <w:sz w:val="64"/>
+                <w:sz w:val="32"/>
               </w:rPr>
               <w:t>Tauragnas</w:t>
             </w:r>
           </w:p>
         </w:tc>
-      </w:tr>
-      <w:tr>
-        <w:trPr>
-          <w:trHeight w:val="2948"/>
-          <w:trHeight w:val="1872000" w:hRule="exact"/>
-        </w:trPr>
         <w:tc>
           <w:tcPr>
-            <w:tcW w:type="dxa" w:w="5102"/>
+            <w:tcW w:type="dxa" w:w="2041"/>
             <w:tcBorders>
               <w:top w:val="dashed" w:sz="12" w:space="0" w:color="888888"/>
               <w:left w:val="dashed" w:sz="12" w:space="0" w:color="888888"/>
@@ -403,7 +365,7 @@
                 <w:rFonts w:ascii="Calibri" w:hAnsi="Calibri" w:cs="Calibri" w:eastAsia="Calibri"/>
                 <w:b/>
                 <w:color w:val="000000"/>
-                <w:sz w:val="64"/>
+                <w:sz w:val="32"/>
               </w:rPr>
               <w:t>Dusia</w:t>
             </w:r>
@@ -411,7 +373,7 @@
         </w:tc>
         <w:tc>
           <w:tcPr>
-            <w:tcW w:type="dxa" w:w="5102"/>
+            <w:tcW w:type="dxa" w:w="2041"/>
             <w:tcBorders>
               <w:top w:val="dashed" w:sz="12" w:space="0" w:color="888888"/>
               <w:left w:val="dashed" w:sz="12" w:space="0" w:color="888888"/>
@@ -429,21 +391,15 @@
                 <w:rFonts w:ascii="Calibri" w:hAnsi="Calibri" w:cs="Calibri" w:eastAsia="Calibri"/>
                 <w:b/>
                 <w:color w:val="000000"/>
-                <w:sz w:val="64"/>
+                <w:sz w:val="32"/>
               </w:rPr>
               <w:t>Sartai</w:t>
             </w:r>
           </w:p>
         </w:tc>
-      </w:tr>
-      <w:tr>
-        <w:trPr>
-          <w:trHeight w:val="2948"/>
-          <w:trHeight w:val="1872000" w:hRule="exact"/>
-        </w:trPr>
         <w:tc>
           <w:tcPr>
-            <w:tcW w:type="dxa" w:w="5102"/>
+            <w:tcW w:type="dxa" w:w="2041"/>
             <w:tcBorders>
               <w:top w:val="dashed" w:sz="12" w:space="0" w:color="888888"/>
               <w:left w:val="dashed" w:sz="12" w:space="0" w:color="888888"/>
@@ -461,15 +417,21 @@
                 <w:rFonts w:ascii="Calibri" w:hAnsi="Calibri" w:cs="Calibri" w:eastAsia="Calibri"/>
                 <w:b/>
                 <w:color w:val="000000"/>
-                <w:sz w:val="64"/>
+                <w:sz w:val="32"/>
               </w:rPr>
               <w:t>Plateliai</w:t>
             </w:r>
           </w:p>
         </w:tc>
+      </w:tr>
+      <w:tr>
+        <w:trPr>
+          <w:trHeight w:val="1417"/>
+          <w:trHeight w:val="900000" w:hRule="exact"/>
+        </w:trPr>
         <w:tc>
           <w:tcPr>
-            <w:tcW w:type="dxa" w:w="5102"/>
+            <w:tcW w:type="dxa" w:w="2041"/>
             <w:tcBorders>
               <w:top w:val="dashed" w:sz="12" w:space="0" w:color="888888"/>
               <w:left w:val="dashed" w:sz="12" w:space="0" w:color="888888"/>
@@ -487,21 +449,15 @@
                 <w:rFonts w:ascii="Calibri" w:hAnsi="Calibri" w:cs="Calibri" w:eastAsia="Calibri"/>
                 <w:b/>
                 <w:color w:val="000000"/>
-                <w:sz w:val="64"/>
+                <w:sz w:val="32"/>
               </w:rPr>
               <w:t>Neris</w:t>
             </w:r>
           </w:p>
         </w:tc>
-      </w:tr>
-      <w:tr>
-        <w:trPr>
-          <w:trHeight w:val="2948"/>
-          <w:trHeight w:val="1872000" w:hRule="exact"/>
-        </w:trPr>
         <w:tc>
           <w:tcPr>
-            <w:tcW w:type="dxa" w:w="5102"/>
+            <w:tcW w:type="dxa" w:w="2041"/>
             <w:tcBorders>
               <w:top w:val="dashed" w:sz="12" w:space="0" w:color="888888"/>
               <w:left w:val="dashed" w:sz="12" w:space="0" w:color="888888"/>
@@ -519,7 +475,7 @@
                 <w:rFonts w:ascii="Calibri" w:hAnsi="Calibri" w:cs="Calibri" w:eastAsia="Calibri"/>
                 <w:b/>
                 <w:color w:val="000000"/>
-                <w:sz w:val="64"/>
+                <w:sz w:val="32"/>
               </w:rPr>
               <w:t>Nemunas</w:t>
             </w:r>
@@ -527,7 +483,7 @@
         </w:tc>
         <w:tc>
           <w:tcPr>
-            <w:tcW w:type="dxa" w:w="5102"/>
+            <w:tcW w:type="dxa" w:w="2041"/>
             <w:tcBorders>
               <w:top w:val="dashed" w:sz="12" w:space="0" w:color="888888"/>
               <w:left w:val="dashed" w:sz="12" w:space="0" w:color="888888"/>
@@ -545,21 +501,15 @@
                 <w:rFonts w:ascii="Calibri" w:hAnsi="Calibri" w:cs="Calibri" w:eastAsia="Calibri"/>
                 <w:b/>
                 <w:color w:val="000000"/>
-                <w:sz w:val="64"/>
+                <w:sz w:val="32"/>
               </w:rPr>
               <w:t>Venta</w:t>
             </w:r>
           </w:p>
         </w:tc>
-      </w:tr>
-      <w:tr>
-        <w:trPr>
-          <w:trHeight w:val="2948"/>
-          <w:trHeight w:val="1872000" w:hRule="exact"/>
-        </w:trPr>
         <w:tc>
           <w:tcPr>
-            <w:tcW w:type="dxa" w:w="5102"/>
+            <w:tcW w:type="dxa" w:w="2041"/>
             <w:tcBorders>
               <w:top w:val="dashed" w:sz="12" w:space="0" w:color="888888"/>
               <w:left w:val="dashed" w:sz="12" w:space="0" w:color="888888"/>
@@ -577,7 +527,7 @@
                 <w:rFonts w:ascii="Calibri" w:hAnsi="Calibri" w:cs="Calibri" w:eastAsia="Calibri"/>
                 <w:b/>
                 <w:color w:val="000000"/>
-                <w:sz w:val="64"/>
+                <w:sz w:val="32"/>
               </w:rPr>
               <w:t>Merkys</w:t>
             </w:r>
@@ -585,7 +535,7 @@
         </w:tc>
         <w:tc>
           <w:tcPr>
-            <w:tcW w:type="dxa" w:w="5102"/>
+            <w:tcW w:type="dxa" w:w="2041"/>
             <w:tcBorders>
               <w:top w:val="dashed" w:sz="12" w:space="0" w:color="888888"/>
               <w:left w:val="dashed" w:sz="12" w:space="0" w:color="888888"/>
@@ -603,38 +553,21 @@
                 <w:rFonts w:ascii="Calibri" w:hAnsi="Calibri" w:cs="Calibri" w:eastAsia="Calibri"/>
                 <w:b/>
                 <w:color w:val="000000"/>
-                <w:sz w:val="64"/>
+                <w:sz w:val="32"/>
               </w:rPr>
               <w:t>Šešupė</w:t>
             </w:r>
           </w:p>
         </w:tc>
       </w:tr>
-    </w:tbl>
-    <w:p>
-      <w:r>
-        <w:br w:type="page"/>
-      </w:r>
-    </w:p>
-    <w:tbl>
-      <w:tblPr>
-        <w:tblW w:type="auto" w:w="0"/>
-        <w:jc w:val="center"/>
-        <w:tblLayout w:type="fixed"/>
-        <w:tblLook w:firstColumn="1" w:firstRow="1" w:lastColumn="0" w:lastRow="0" w:noHBand="0" w:noVBand="1" w:val="04A0"/>
-      </w:tblPr>
-      <w:tblGrid>
-        <w:gridCol w:w="5386"/>
-        <w:gridCol w:w="5386"/>
-      </w:tblGrid>
       <w:tr>
         <w:trPr>
-          <w:trHeight w:val="2948"/>
-          <w:trHeight w:val="1872000" w:hRule="exact"/>
+          <w:trHeight w:val="1417"/>
+          <w:trHeight w:val="900000" w:hRule="exact"/>
         </w:trPr>
         <w:tc>
           <w:tcPr>
-            <w:tcW w:type="dxa" w:w="5102"/>
+            <w:tcW w:type="dxa" w:w="2041"/>
             <w:tcBorders>
               <w:top w:val="dashed" w:sz="12" w:space="0" w:color="888888"/>
               <w:left w:val="dashed" w:sz="12" w:space="0" w:color="888888"/>
@@ -652,7 +585,7 @@
                 <w:rFonts w:ascii="Calibri" w:hAnsi="Calibri" w:cs="Calibri" w:eastAsia="Calibri"/>
                 <w:b/>
                 <w:color w:val="000000"/>
-                <w:sz w:val="64"/>
+                <w:sz w:val="32"/>
               </w:rPr>
               <w:t>Asveja</w:t>
             </w:r>
@@ -660,7 +593,7 @@
         </w:tc>
         <w:tc>
           <w:tcPr>
-            <w:tcW w:type="dxa" w:w="5102"/>
+            <w:tcW w:type="dxa" w:w="2041"/>
             <w:tcBorders>
               <w:top w:val="dashed" w:sz="12" w:space="0" w:color="888888"/>
               <w:left w:val="dashed" w:sz="12" w:space="0" w:color="888888"/>
@@ -678,21 +611,15 @@
                 <w:rFonts w:ascii="Calibri" w:hAnsi="Calibri" w:cs="Calibri" w:eastAsia="Calibri"/>
                 <w:b/>
                 <w:color w:val="000000"/>
-                <w:sz w:val="64"/>
+                <w:sz w:val="32"/>
               </w:rPr>
               <w:t>Tauragnas</w:t>
             </w:r>
           </w:p>
         </w:tc>
-      </w:tr>
-      <w:tr>
-        <w:trPr>
-          <w:trHeight w:val="2948"/>
-          <w:trHeight w:val="1872000" w:hRule="exact"/>
-        </w:trPr>
         <w:tc>
           <w:tcPr>
-            <w:tcW w:type="dxa" w:w="5102"/>
+            <w:tcW w:type="dxa" w:w="2041"/>
             <w:tcBorders>
               <w:top w:val="dashed" w:sz="12" w:space="0" w:color="888888"/>
               <w:left w:val="dashed" w:sz="12" w:space="0" w:color="888888"/>
@@ -710,7 +637,7 @@
                 <w:rFonts w:ascii="Calibri" w:hAnsi="Calibri" w:cs="Calibri" w:eastAsia="Calibri"/>
                 <w:b/>
                 <w:color w:val="000000"/>
-                <w:sz w:val="64"/>
+                <w:sz w:val="32"/>
               </w:rPr>
               <w:t>Dusia</w:t>
             </w:r>
@@ -718,7 +645,7 @@
         </w:tc>
         <w:tc>
           <w:tcPr>
-            <w:tcW w:type="dxa" w:w="5102"/>
+            <w:tcW w:type="dxa" w:w="2041"/>
             <w:tcBorders>
               <w:top w:val="dashed" w:sz="12" w:space="0" w:color="888888"/>
               <w:left w:val="dashed" w:sz="12" w:space="0" w:color="888888"/>
@@ -736,21 +663,15 @@
                 <w:rFonts w:ascii="Calibri" w:hAnsi="Calibri" w:cs="Calibri" w:eastAsia="Calibri"/>
                 <w:b/>
                 <w:color w:val="000000"/>
-                <w:sz w:val="64"/>
+                <w:sz w:val="32"/>
               </w:rPr>
               <w:t>Sartai</w:t>
             </w:r>
           </w:p>
         </w:tc>
-      </w:tr>
-      <w:tr>
-        <w:trPr>
-          <w:trHeight w:val="2948"/>
-          <w:trHeight w:val="1872000" w:hRule="exact"/>
-        </w:trPr>
         <w:tc>
           <w:tcPr>
-            <w:tcW w:type="dxa" w:w="5102"/>
+            <w:tcW w:type="dxa" w:w="2041"/>
             <w:tcBorders>
               <w:top w:val="dashed" w:sz="12" w:space="0" w:color="888888"/>
               <w:left w:val="dashed" w:sz="12" w:space="0" w:color="888888"/>
@@ -768,15 +689,21 @@
                 <w:rFonts w:ascii="Calibri" w:hAnsi="Calibri" w:cs="Calibri" w:eastAsia="Calibri"/>
                 <w:b/>
                 <w:color w:val="000000"/>
-                <w:sz w:val="64"/>
+                <w:sz w:val="32"/>
               </w:rPr>
               <w:t>Plateliai</w:t>
             </w:r>
           </w:p>
         </w:tc>
+      </w:tr>
+      <w:tr>
+        <w:trPr>
+          <w:trHeight w:val="1417"/>
+          <w:trHeight w:val="900000" w:hRule="exact"/>
+        </w:trPr>
         <w:tc>
           <w:tcPr>
-            <w:tcW w:type="dxa" w:w="5102"/>
+            <w:tcW w:type="dxa" w:w="2041"/>
             <w:tcBorders>
               <w:top w:val="dashed" w:sz="12" w:space="0" w:color="888888"/>
               <w:left w:val="dashed" w:sz="12" w:space="0" w:color="888888"/>
@@ -794,21 +721,15 @@
                 <w:rFonts w:ascii="Calibri" w:hAnsi="Calibri" w:cs="Calibri" w:eastAsia="Calibri"/>
                 <w:b/>
                 <w:color w:val="000000"/>
-                <w:sz w:val="64"/>
+                <w:sz w:val="32"/>
               </w:rPr>
               <w:t>Neris</w:t>
             </w:r>
           </w:p>
         </w:tc>
-      </w:tr>
-      <w:tr>
-        <w:trPr>
-          <w:trHeight w:val="2948"/>
-          <w:trHeight w:val="1872000" w:hRule="exact"/>
-        </w:trPr>
         <w:tc>
           <w:tcPr>
-            <w:tcW w:type="dxa" w:w="5102"/>
+            <w:tcW w:type="dxa" w:w="2041"/>
             <w:tcBorders>
               <w:top w:val="dashed" w:sz="12" w:space="0" w:color="888888"/>
               <w:left w:val="dashed" w:sz="12" w:space="0" w:color="888888"/>
@@ -826,7 +747,7 @@
                 <w:rFonts w:ascii="Calibri" w:hAnsi="Calibri" w:cs="Calibri" w:eastAsia="Calibri"/>
                 <w:b/>
                 <w:color w:val="000000"/>
-                <w:sz w:val="64"/>
+                <w:sz w:val="32"/>
               </w:rPr>
               <w:t>Nemunas</w:t>
             </w:r>
@@ -834,7 +755,7 @@
         </w:tc>
         <w:tc>
           <w:tcPr>
-            <w:tcW w:type="dxa" w:w="5102"/>
+            <w:tcW w:type="dxa" w:w="2041"/>
             <w:tcBorders>
               <w:top w:val="dashed" w:sz="12" w:space="0" w:color="888888"/>
               <w:left w:val="dashed" w:sz="12" w:space="0" w:color="888888"/>
@@ -852,21 +773,15 @@
                 <w:rFonts w:ascii="Calibri" w:hAnsi="Calibri" w:cs="Calibri" w:eastAsia="Calibri"/>
                 <w:b/>
                 <w:color w:val="000000"/>
-                <w:sz w:val="64"/>
+                <w:sz w:val="32"/>
               </w:rPr>
               <w:t>Venta</w:t>
             </w:r>
           </w:p>
         </w:tc>
-      </w:tr>
-      <w:tr>
-        <w:trPr>
-          <w:trHeight w:val="2948"/>
-          <w:trHeight w:val="1872000" w:hRule="exact"/>
-        </w:trPr>
         <w:tc>
           <w:tcPr>
-            <w:tcW w:type="dxa" w:w="5102"/>
+            <w:tcW w:type="dxa" w:w="2041"/>
             <w:tcBorders>
               <w:top w:val="dashed" w:sz="12" w:space="0" w:color="888888"/>
               <w:left w:val="dashed" w:sz="12" w:space="0" w:color="888888"/>
@@ -884,7 +799,7 @@
                 <w:rFonts w:ascii="Calibri" w:hAnsi="Calibri" w:cs="Calibri" w:eastAsia="Calibri"/>
                 <w:b/>
                 <w:color w:val="000000"/>
-                <w:sz w:val="64"/>
+                <w:sz w:val="32"/>
               </w:rPr>
               <w:t>Merkys</w:t>
             </w:r>
@@ -892,7 +807,7 @@
         </w:tc>
         <w:tc>
           <w:tcPr>
-            <w:tcW w:type="dxa" w:w="5102"/>
+            <w:tcW w:type="dxa" w:w="2041"/>
             <w:tcBorders>
               <w:top w:val="dashed" w:sz="12" w:space="0" w:color="888888"/>
               <w:left w:val="dashed" w:sz="12" w:space="0" w:color="888888"/>
@@ -910,38 +825,21 @@
                 <w:rFonts w:ascii="Calibri" w:hAnsi="Calibri" w:cs="Calibri" w:eastAsia="Calibri"/>
                 <w:b/>
                 <w:color w:val="000000"/>
-                <w:sz w:val="64"/>
+                <w:sz w:val="32"/>
               </w:rPr>
               <w:t>Šešupė</w:t>
             </w:r>
           </w:p>
         </w:tc>
       </w:tr>
-    </w:tbl>
-    <w:p>
-      <w:r>
-        <w:br w:type="page"/>
-      </w:r>
-    </w:p>
-    <w:tbl>
-      <w:tblPr>
-        <w:tblW w:type="auto" w:w="0"/>
-        <w:jc w:val="center"/>
-        <w:tblLayout w:type="fixed"/>
-        <w:tblLook w:firstColumn="1" w:firstRow="1" w:lastColumn="0" w:lastRow="0" w:noHBand="0" w:noVBand="1" w:val="04A0"/>
-      </w:tblPr>
-      <w:tblGrid>
-        <w:gridCol w:w="5386"/>
-        <w:gridCol w:w="5386"/>
-      </w:tblGrid>
       <w:tr>
         <w:trPr>
-          <w:trHeight w:val="2948"/>
-          <w:trHeight w:val="1872000" w:hRule="exact"/>
+          <w:trHeight w:val="1417"/>
+          <w:trHeight w:val="900000" w:hRule="exact"/>
         </w:trPr>
         <w:tc>
           <w:tcPr>
-            <w:tcW w:type="dxa" w:w="5102"/>
+            <w:tcW w:type="dxa" w:w="2041"/>
             <w:tcBorders>
               <w:top w:val="dashed" w:sz="12" w:space="0" w:color="888888"/>
               <w:left w:val="dashed" w:sz="12" w:space="0" w:color="888888"/>
@@ -959,7 +857,7 @@
                 <w:rFonts w:ascii="Calibri" w:hAnsi="Calibri" w:cs="Calibri" w:eastAsia="Calibri"/>
                 <w:b/>
                 <w:color w:val="000000"/>
-                <w:sz w:val="64"/>
+                <w:sz w:val="32"/>
               </w:rPr>
               <w:t>Asveja</w:t>
             </w:r>
@@ -967,7 +865,7 @@
         </w:tc>
         <w:tc>
           <w:tcPr>
-            <w:tcW w:type="dxa" w:w="5102"/>
+            <w:tcW w:type="dxa" w:w="2041"/>
             <w:tcBorders>
               <w:top w:val="dashed" w:sz="12" w:space="0" w:color="888888"/>
               <w:left w:val="dashed" w:sz="12" w:space="0" w:color="888888"/>
@@ -985,21 +883,15 @@
                 <w:rFonts w:ascii="Calibri" w:hAnsi="Calibri" w:cs="Calibri" w:eastAsia="Calibri"/>
                 <w:b/>
                 <w:color w:val="000000"/>
-                <w:sz w:val="64"/>
+                <w:sz w:val="32"/>
               </w:rPr>
               <w:t>Tauragnas</w:t>
             </w:r>
           </w:p>
         </w:tc>
-      </w:tr>
-      <w:tr>
-        <w:trPr>
-          <w:trHeight w:val="2948"/>
-          <w:trHeight w:val="1872000" w:hRule="exact"/>
-        </w:trPr>
         <w:tc>
           <w:tcPr>
-            <w:tcW w:type="dxa" w:w="5102"/>
+            <w:tcW w:type="dxa" w:w="2041"/>
             <w:tcBorders>
               <w:top w:val="dashed" w:sz="12" w:space="0" w:color="888888"/>
               <w:left w:val="dashed" w:sz="12" w:space="0" w:color="888888"/>
@@ -1017,7 +909,7 @@
                 <w:rFonts w:ascii="Calibri" w:hAnsi="Calibri" w:cs="Calibri" w:eastAsia="Calibri"/>
                 <w:b/>
                 <w:color w:val="000000"/>
-                <w:sz w:val="64"/>
+                <w:sz w:val="32"/>
               </w:rPr>
               <w:t>Dusia</w:t>
             </w:r>
@@ -1025,7 +917,7 @@
         </w:tc>
         <w:tc>
           <w:tcPr>
-            <w:tcW w:type="dxa" w:w="5102"/>
+            <w:tcW w:type="dxa" w:w="2041"/>
             <w:tcBorders>
               <w:top w:val="dashed" w:sz="12" w:space="0" w:color="888888"/>
               <w:left w:val="dashed" w:sz="12" w:space="0" w:color="888888"/>
@@ -1043,21 +935,15 @@
                 <w:rFonts w:ascii="Calibri" w:hAnsi="Calibri" w:cs="Calibri" w:eastAsia="Calibri"/>
                 <w:b/>
                 <w:color w:val="000000"/>
-                <w:sz w:val="64"/>
+                <w:sz w:val="32"/>
               </w:rPr>
               <w:t>Sartai</w:t>
             </w:r>
           </w:p>
         </w:tc>
-      </w:tr>
-      <w:tr>
-        <w:trPr>
-          <w:trHeight w:val="2948"/>
-          <w:trHeight w:val="1872000" w:hRule="exact"/>
-        </w:trPr>
         <w:tc>
           <w:tcPr>
-            <w:tcW w:type="dxa" w:w="5102"/>
+            <w:tcW w:type="dxa" w:w="2041"/>
             <w:tcBorders>
               <w:top w:val="dashed" w:sz="12" w:space="0" w:color="888888"/>
               <w:left w:val="dashed" w:sz="12" w:space="0" w:color="888888"/>
@@ -1075,15 +961,21 @@
                 <w:rFonts w:ascii="Calibri" w:hAnsi="Calibri" w:cs="Calibri" w:eastAsia="Calibri"/>
                 <w:b/>
                 <w:color w:val="000000"/>
-                <w:sz w:val="64"/>
+                <w:sz w:val="32"/>
               </w:rPr>
               <w:t>Plateliai</w:t>
             </w:r>
           </w:p>
         </w:tc>
+      </w:tr>
+      <w:tr>
+        <w:trPr>
+          <w:trHeight w:val="1417"/>
+          <w:trHeight w:val="900000" w:hRule="exact"/>
+        </w:trPr>
         <w:tc>
           <w:tcPr>
-            <w:tcW w:type="dxa" w:w="5102"/>
+            <w:tcW w:type="dxa" w:w="2041"/>
             <w:tcBorders>
               <w:top w:val="dashed" w:sz="12" w:space="0" w:color="888888"/>
               <w:left w:val="dashed" w:sz="12" w:space="0" w:color="888888"/>
@@ -1101,21 +993,15 @@
                 <w:rFonts w:ascii="Calibri" w:hAnsi="Calibri" w:cs="Calibri" w:eastAsia="Calibri"/>
                 <w:b/>
                 <w:color w:val="000000"/>
-                <w:sz w:val="64"/>
+                <w:sz w:val="32"/>
               </w:rPr>
               <w:t>Neris</w:t>
             </w:r>
           </w:p>
         </w:tc>
-      </w:tr>
-      <w:tr>
-        <w:trPr>
-          <w:trHeight w:val="2948"/>
-          <w:trHeight w:val="1872000" w:hRule="exact"/>
-        </w:trPr>
         <w:tc>
           <w:tcPr>
-            <w:tcW w:type="dxa" w:w="5102"/>
+            <w:tcW w:type="dxa" w:w="2041"/>
             <w:tcBorders>
               <w:top w:val="dashed" w:sz="12" w:space="0" w:color="888888"/>
               <w:left w:val="dashed" w:sz="12" w:space="0" w:color="888888"/>
@@ -1133,7 +1019,7 @@
                 <w:rFonts w:ascii="Calibri" w:hAnsi="Calibri" w:cs="Calibri" w:eastAsia="Calibri"/>
                 <w:b/>
                 <w:color w:val="000000"/>
-                <w:sz w:val="64"/>
+                <w:sz w:val="32"/>
               </w:rPr>
               <w:t>Nemunas</w:t>
             </w:r>
@@ -1141,7 +1027,7 @@
         </w:tc>
         <w:tc>
           <w:tcPr>
-            <w:tcW w:type="dxa" w:w="5102"/>
+            <w:tcW w:type="dxa" w:w="2041"/>
             <w:tcBorders>
               <w:top w:val="dashed" w:sz="12" w:space="0" w:color="888888"/>
               <w:left w:val="dashed" w:sz="12" w:space="0" w:color="888888"/>
@@ -1159,21 +1045,15 @@
                 <w:rFonts w:ascii="Calibri" w:hAnsi="Calibri" w:cs="Calibri" w:eastAsia="Calibri"/>
                 <w:b/>
                 <w:color w:val="000000"/>
-                <w:sz w:val="64"/>
+                <w:sz w:val="32"/>
               </w:rPr>
               <w:t>Venta</w:t>
             </w:r>
           </w:p>
         </w:tc>
-      </w:tr>
-      <w:tr>
-        <w:trPr>
-          <w:trHeight w:val="2948"/>
-          <w:trHeight w:val="1872000" w:hRule="exact"/>
-        </w:trPr>
         <w:tc>
           <w:tcPr>
-            <w:tcW w:type="dxa" w:w="5102"/>
+            <w:tcW w:type="dxa" w:w="2041"/>
             <w:tcBorders>
               <w:top w:val="dashed" w:sz="12" w:space="0" w:color="888888"/>
               <w:left w:val="dashed" w:sz="12" w:space="0" w:color="888888"/>
@@ -1191,7 +1071,7 @@
                 <w:rFonts w:ascii="Calibri" w:hAnsi="Calibri" w:cs="Calibri" w:eastAsia="Calibri"/>
                 <w:b/>
                 <w:color w:val="000000"/>
-                <w:sz w:val="64"/>
+                <w:sz w:val="32"/>
               </w:rPr>
               <w:t>Merkys</w:t>
             </w:r>
@@ -1199,7 +1079,7 @@
         </w:tc>
         <w:tc>
           <w:tcPr>
-            <w:tcW w:type="dxa" w:w="5102"/>
+            <w:tcW w:type="dxa" w:w="2041"/>
             <w:tcBorders>
               <w:top w:val="dashed" w:sz="12" w:space="0" w:color="888888"/>
               <w:left w:val="dashed" w:sz="12" w:space="0" w:color="888888"/>
@@ -1217,38 +1097,21 @@
                 <w:rFonts w:ascii="Calibri" w:hAnsi="Calibri" w:cs="Calibri" w:eastAsia="Calibri"/>
                 <w:b/>
                 <w:color w:val="000000"/>
-                <w:sz w:val="64"/>
+                <w:sz w:val="32"/>
               </w:rPr>
               <w:t>Šešupė</w:t>
             </w:r>
           </w:p>
         </w:tc>
       </w:tr>
-    </w:tbl>
-    <w:p>
-      <w:r>
-        <w:br w:type="page"/>
-      </w:r>
-    </w:p>
-    <w:tbl>
-      <w:tblPr>
-        <w:tblW w:type="auto" w:w="0"/>
-        <w:jc w:val="center"/>
-        <w:tblLayout w:type="fixed"/>
-        <w:tblLook w:firstColumn="1" w:firstRow="1" w:lastColumn="0" w:lastRow="0" w:noHBand="0" w:noVBand="1" w:val="04A0"/>
-      </w:tblPr>
-      <w:tblGrid>
-        <w:gridCol w:w="5386"/>
-        <w:gridCol w:w="5386"/>
-      </w:tblGrid>
       <w:tr>
         <w:trPr>
-          <w:trHeight w:val="2948"/>
-          <w:trHeight w:val="1872000" w:hRule="exact"/>
+          <w:trHeight w:val="1417"/>
+          <w:trHeight w:val="900000" w:hRule="exact"/>
         </w:trPr>
         <w:tc>
           <w:tcPr>
-            <w:tcW w:type="dxa" w:w="5102"/>
+            <w:tcW w:type="dxa" w:w="2041"/>
             <w:tcBorders>
               <w:top w:val="dashed" w:sz="12" w:space="0" w:color="888888"/>
               <w:left w:val="dashed" w:sz="12" w:space="0" w:color="888888"/>
@@ -1266,7 +1129,7 @@
                 <w:rFonts w:ascii="Calibri" w:hAnsi="Calibri" w:cs="Calibri" w:eastAsia="Calibri"/>
                 <w:b/>
                 <w:color w:val="000000"/>
-                <w:sz w:val="64"/>
+                <w:sz w:val="32"/>
               </w:rPr>
               <w:t>Asveja</w:t>
             </w:r>
@@ -1274,7 +1137,7 @@
         </w:tc>
         <w:tc>
           <w:tcPr>
-            <w:tcW w:type="dxa" w:w="5102"/>
+            <w:tcW w:type="dxa" w:w="2041"/>
             <w:tcBorders>
               <w:top w:val="dashed" w:sz="12" w:space="0" w:color="888888"/>
               <w:left w:val="dashed" w:sz="12" w:space="0" w:color="888888"/>
@@ -1292,21 +1155,15 @@
                 <w:rFonts w:ascii="Calibri" w:hAnsi="Calibri" w:cs="Calibri" w:eastAsia="Calibri"/>
                 <w:b/>
                 <w:color w:val="000000"/>
-                <w:sz w:val="64"/>
+                <w:sz w:val="32"/>
               </w:rPr>
               <w:t>Tauragnas</w:t>
             </w:r>
           </w:p>
         </w:tc>
-      </w:tr>
-      <w:tr>
-        <w:trPr>
-          <w:trHeight w:val="2948"/>
-          <w:trHeight w:val="1872000" w:hRule="exact"/>
-        </w:trPr>
         <w:tc>
           <w:tcPr>
-            <w:tcW w:type="dxa" w:w="5102"/>
+            <w:tcW w:type="dxa" w:w="2041"/>
             <w:tcBorders>
               <w:top w:val="dashed" w:sz="12" w:space="0" w:color="888888"/>
               <w:left w:val="dashed" w:sz="12" w:space="0" w:color="888888"/>
@@ -1324,7 +1181,7 @@
                 <w:rFonts w:ascii="Calibri" w:hAnsi="Calibri" w:cs="Calibri" w:eastAsia="Calibri"/>
                 <w:b/>
                 <w:color w:val="000000"/>
-                <w:sz w:val="64"/>
+                <w:sz w:val="32"/>
               </w:rPr>
               <w:t>Dusia</w:t>
             </w:r>
@@ -1332,7 +1189,7 @@
         </w:tc>
         <w:tc>
           <w:tcPr>
-            <w:tcW w:type="dxa" w:w="5102"/>
+            <w:tcW w:type="dxa" w:w="2041"/>
             <w:tcBorders>
               <w:top w:val="dashed" w:sz="12" w:space="0" w:color="888888"/>
               <w:left w:val="dashed" w:sz="12" w:space="0" w:color="888888"/>
@@ -1350,21 +1207,15 @@
                 <w:rFonts w:ascii="Calibri" w:hAnsi="Calibri" w:cs="Calibri" w:eastAsia="Calibri"/>
                 <w:b/>
                 <w:color w:val="000000"/>
-                <w:sz w:val="64"/>
+                <w:sz w:val="32"/>
               </w:rPr>
               <w:t>Sartai</w:t>
             </w:r>
           </w:p>
         </w:tc>
-      </w:tr>
-      <w:tr>
-        <w:trPr>
-          <w:trHeight w:val="2948"/>
-          <w:trHeight w:val="1872000" w:hRule="exact"/>
-        </w:trPr>
         <w:tc>
           <w:tcPr>
-            <w:tcW w:type="dxa" w:w="5102"/>
+            <w:tcW w:type="dxa" w:w="2041"/>
             <w:tcBorders>
               <w:top w:val="dashed" w:sz="12" w:space="0" w:color="888888"/>
               <w:left w:val="dashed" w:sz="12" w:space="0" w:color="888888"/>
@@ -1382,15 +1233,21 @@
                 <w:rFonts w:ascii="Calibri" w:hAnsi="Calibri" w:cs="Calibri" w:eastAsia="Calibri"/>
                 <w:b/>
                 <w:color w:val="000000"/>
-                <w:sz w:val="64"/>
+                <w:sz w:val="32"/>
               </w:rPr>
               <w:t>Plateliai</w:t>
             </w:r>
           </w:p>
         </w:tc>
+      </w:tr>
+      <w:tr>
+        <w:trPr>
+          <w:trHeight w:val="1417"/>
+          <w:trHeight w:val="900000" w:hRule="exact"/>
+        </w:trPr>
         <w:tc>
           <w:tcPr>
-            <w:tcW w:type="dxa" w:w="5102"/>
+            <w:tcW w:type="dxa" w:w="2041"/>
             <w:tcBorders>
               <w:top w:val="dashed" w:sz="12" w:space="0" w:color="888888"/>
               <w:left w:val="dashed" w:sz="12" w:space="0" w:color="888888"/>
@@ -1408,21 +1265,15 @@
                 <w:rFonts w:ascii="Calibri" w:hAnsi="Calibri" w:cs="Calibri" w:eastAsia="Calibri"/>
                 <w:b/>
                 <w:color w:val="000000"/>
-                <w:sz w:val="64"/>
+                <w:sz w:val="32"/>
               </w:rPr>
               <w:t>Neris</w:t>
             </w:r>
           </w:p>
         </w:tc>
-      </w:tr>
-      <w:tr>
-        <w:trPr>
-          <w:trHeight w:val="2948"/>
-          <w:trHeight w:val="1872000" w:hRule="exact"/>
-        </w:trPr>
         <w:tc>
           <w:tcPr>
-            <w:tcW w:type="dxa" w:w="5102"/>
+            <w:tcW w:type="dxa" w:w="2041"/>
             <w:tcBorders>
               <w:top w:val="dashed" w:sz="12" w:space="0" w:color="888888"/>
               <w:left w:val="dashed" w:sz="12" w:space="0" w:color="888888"/>
@@ -1440,7 +1291,7 @@
                 <w:rFonts w:ascii="Calibri" w:hAnsi="Calibri" w:cs="Calibri" w:eastAsia="Calibri"/>
                 <w:b/>
                 <w:color w:val="000000"/>
-                <w:sz w:val="64"/>
+                <w:sz w:val="32"/>
               </w:rPr>
               <w:t>Nemunas</w:t>
             </w:r>
@@ -1448,7 +1299,7 @@
         </w:tc>
         <w:tc>
           <w:tcPr>
-            <w:tcW w:type="dxa" w:w="5102"/>
+            <w:tcW w:type="dxa" w:w="2041"/>
             <w:tcBorders>
               <w:top w:val="dashed" w:sz="12" w:space="0" w:color="888888"/>
               <w:left w:val="dashed" w:sz="12" w:space="0" w:color="888888"/>
@@ -1466,21 +1317,15 @@
                 <w:rFonts w:ascii="Calibri" w:hAnsi="Calibri" w:cs="Calibri" w:eastAsia="Calibri"/>
                 <w:b/>
                 <w:color w:val="000000"/>
-                <w:sz w:val="64"/>
+                <w:sz w:val="32"/>
               </w:rPr>
               <w:t>Venta</w:t>
             </w:r>
           </w:p>
         </w:tc>
-      </w:tr>
-      <w:tr>
-        <w:trPr>
-          <w:trHeight w:val="2948"/>
-          <w:trHeight w:val="1872000" w:hRule="exact"/>
-        </w:trPr>
         <w:tc>
           <w:tcPr>
-            <w:tcW w:type="dxa" w:w="5102"/>
+            <w:tcW w:type="dxa" w:w="2041"/>
             <w:tcBorders>
               <w:top w:val="dashed" w:sz="12" w:space="0" w:color="888888"/>
               <w:left w:val="dashed" w:sz="12" w:space="0" w:color="888888"/>
@@ -1498,7 +1343,7 @@
                 <w:rFonts w:ascii="Calibri" w:hAnsi="Calibri" w:cs="Calibri" w:eastAsia="Calibri"/>
                 <w:b/>
                 <w:color w:val="000000"/>
-                <w:sz w:val="64"/>
+                <w:sz w:val="32"/>
               </w:rPr>
               <w:t>Merkys</w:t>
             </w:r>
@@ -1506,7 +1351,7 @@
         </w:tc>
         <w:tc>
           <w:tcPr>
-            <w:tcW w:type="dxa" w:w="5102"/>
+            <w:tcW w:type="dxa" w:w="2041"/>
             <w:tcBorders>
               <w:top w:val="dashed" w:sz="12" w:space="0" w:color="888888"/>
               <w:left w:val="dashed" w:sz="12" w:space="0" w:color="888888"/>
@@ -1524,7 +1369,7 @@
                 <w:rFonts w:ascii="Calibri" w:hAnsi="Calibri" w:cs="Calibri" w:eastAsia="Calibri"/>
                 <w:b/>
                 <w:color w:val="000000"/>
-                <w:sz w:val="64"/>
+                <w:sz w:val="32"/>
               </w:rPr>
               <w:t>Šešupė</w:t>
             </w:r>

</xml_diff>